<commit_message>
Templates: suppression des surlignages gris sur les zones editables (lightGray/darkGray)
Co-Authored-By: Claude Sonnet 4.6 <noreply@anthropic.com>
</commit_message>
<xml_diff>
--- a/public/templates/template_C2.docx
+++ b/public/templates/template_C2.docx
@@ -409,7 +409,6 @@
           <w:bCs/>
           <w:sz w:val="28"/>
           <w:szCs w:val="28"/>
-          <w:highlight w:val="lightGray"/>
         </w:rPr>
         <w:t>{nom_client}</w:t>
       </w:r>
@@ -495,16 +494,13 @@
     <w:p>
       <w:pPr>
         <w:ind w:left="352" w:right="33" w:firstLine="0"/>
-        <w:rPr>
-          <w:highlight w:val="lightGray"/>
-        </w:rPr>
+        <w:rPr/>
       </w:pPr>
       <w:permStart w:id="1348362044" w:edGrp="everyone"/>
       <w:r>
         <w:rPr>
           <w:b/>
           <w:bCs/>
-          <w:highlight w:val="lightGray"/>
         </w:rPr>
         <w:t>{nom_client}</w:t>
       </w:r>
@@ -519,9 +515,7 @@
       </w:pPr>
       <w:permStart w:id="1142845709" w:edGrp="everyone"/>
       <w:r>
-        <w:rPr>
-          <w:highlight w:val="lightGray"/>
-        </w:rPr>
+        <w:rPr/>
         <w:t>{forme_juridique}</w:t>
       </w:r>
       <w:permEnd w:id="1142845709"/>
@@ -538,9 +532,7 @@
       </w:r>
       <w:permStart w:id="145585820" w:edGrp="everyone"/>
       <w:r>
-        <w:rPr>
-          <w:highlight w:val="lightGray"/>
-        </w:rPr>
+        <w:rPr/>
         <w:t>{capital_social}</w:t>
       </w:r>
       <w:permEnd w:id="145585820"/>
@@ -557,9 +549,7 @@
       </w:r>
       <w:permStart w:id="1701016656" w:edGrp="everyone"/>
       <w:r>
-        <w:rPr>
-          <w:highlight w:val="lightGray"/>
-        </w:rPr>
+        <w:rPr/>
         <w:t>{adresse_siege}</w:t>
       </w:r>
       <w:permEnd w:id="1701016656"/>
@@ -576,9 +566,7 @@
       </w:r>
       <w:permStart w:id="255678206" w:edGrp="everyone"/>
       <w:r>
-        <w:rPr>
-          <w:highlight w:val="lightGray"/>
-        </w:rPr>
+        <w:rPr/>
         <w:t>{ville_rcs}</w:t>
       </w:r>
       <w:permEnd w:id="255678206"/>
@@ -592,9 +580,7 @@
       </w:r>
       <w:permStart w:id="993936332" w:edGrp="everyone"/>
       <w:r>
-        <w:rPr>
-          <w:highlight w:val="lightGray"/>
-        </w:rPr>
+        <w:rPr/>
         <w:t>{siren}</w:t>
       </w:r>
       <w:permEnd w:id="993936332"/>
@@ -611,9 +597,7 @@
       </w:r>
       <w:permStart w:id="619215143" w:edGrp="everyone"/>
       <w:r>
-        <w:rPr>
-          <w:highlight w:val="lightGray"/>
-        </w:rPr>
+        <w:rPr/>
         <w:t>{prenom_nom_signataire}</w:t>
       </w:r>
       <w:permEnd w:id="619215143"/>
@@ -630,9 +614,7 @@
       </w:r>
       <w:permStart w:id="1257311420" w:edGrp="everyone"/>
       <w:r>
-        <w:rPr>
-          <w:highlight w:val="lightGray"/>
-        </w:rPr>
+        <w:rPr/>
         <w:t>{fonction_signataire}</w:t>
       </w:r>
       <w:permEnd w:id="1257311420"/>
@@ -1451,9 +1433,7 @@
             </w:pPr>
             <w:permStart w:id="340280568" w:edGrp="everyone"/>
             <w:r>
-              <w:rPr>
-                <w:highlight w:val="lightGray"/>
-              </w:rPr>
+              <w:rPr/>
               <w:t>Non</w:t>
             </w:r>
             <w:permEnd w:id="340280568"/>
@@ -2025,15 +2005,11 @@
         <w:spacing w:after="0" w:line="259" w:lineRule="auto"/>
         <w:ind w:left="567" w:firstLine="0"/>
         <w:jc w:val="left"/>
-        <w:rPr>
-          <w:highlight w:val="darkGray"/>
-        </w:rPr>
+        <w:rPr/>
       </w:pPr>
       <w:sdt>
         <w:sdtPr>
-          <w:rPr>
-            <w:highlight w:val="lightGray"/>
-          </w:rPr>
+          <w:rPr/>
           <w:id w:val="375969349"/>
           <w14:checkbox>
             <w14:checked w14:val="0"/>
@@ -2047,7 +2023,6 @@
           <w:r>
             <w:rPr>
               <w:rFonts w:ascii="MS Gothic" w:eastAsia="MS Gothic" w:hAnsi="MS Gothic" w:hint="eastAsia"/>
-              <w:highlight w:val="lightGray"/>
             </w:rPr>
             <w:t>{cee_check_soumis}</w:t>
           </w:r>
@@ -2063,15 +2038,11 @@
         <w:spacing w:after="0" w:line="259" w:lineRule="auto"/>
         <w:ind w:left="567" w:firstLine="0"/>
         <w:jc w:val="left"/>
-        <w:rPr>
-          <w:highlight w:val="lightGray"/>
-        </w:rPr>
+        <w:rPr/>
       </w:pPr>
       <w:sdt>
         <w:sdtPr>
-          <w:rPr>
-            <w:highlight w:val="lightGray"/>
-          </w:rPr>
+          <w:rPr/>
           <w:id w:val="-2130466417"/>
           <w14:checkbox>
             <w14:checked w14:val="0"/>
@@ -2085,7 +2056,6 @@
           <w:r>
             <w:rPr>
               <w:rFonts w:ascii="MS Gothic" w:eastAsia="MS Gothic" w:hAnsi="MS Gothic" w:hint="eastAsia"/>
-              <w:highlight w:val="lightGray"/>
             </w:rPr>
             <w:t>{cee_check_non_soumis}</w:t>
           </w:r>
@@ -2104,9 +2074,7 @@
       </w:pPr>
       <w:sdt>
         <w:sdtPr>
-          <w:rPr>
-            <w:highlight w:val="lightGray"/>
-          </w:rPr>
+          <w:rPr/>
           <w:id w:val="-1622689654"/>
           <w14:checkbox>
             <w14:checked w14:val="0"/>
@@ -2120,7 +2088,6 @@
           <w:r>
             <w:rPr>
               <w:rFonts w:ascii="MS Gothic" w:eastAsia="MS Gothic" w:hAnsi="MS Gothic" w:hint="eastAsia"/>
-              <w:highlight w:val="lightGray"/>
             </w:rPr>
             <w:t>{cee_check_mixte}</w:t>
           </w:r>
@@ -2219,9 +2186,7 @@
       </w:pPr>
       <w:sdt>
         <w:sdtPr>
-          <w:rPr>
-            <w:highlight w:val="lightGray"/>
-          </w:rPr>
+          <w:rPr/>
           <w:id w:val="-103116684"/>
           <w14:checkbox>
             <w14:checked w14:val="0"/>
@@ -2235,7 +2200,6 @@
           <w:r>
             <w:rPr>
               <w:rFonts w:ascii="MS Gothic" w:eastAsia="MS Gothic" w:hAnsi="MS Gothic" w:hint="eastAsia"/>
-              <w:highlight w:val="lightGray"/>
             </w:rPr>
             <w:t>☐</w:t>
           </w:r>
@@ -2253,9 +2217,7 @@
       </w:pPr>
       <w:sdt>
         <w:sdtPr>
-          <w:rPr>
-            <w:highlight w:val="lightGray"/>
-          </w:rPr>
+          <w:rPr/>
           <w:id w:val="1858773412"/>
           <w14:checkbox>
             <w14:checked w14:val="0"/>
@@ -2269,7 +2231,6 @@
           <w:r>
             <w:rPr>
               <w:rFonts w:ascii="MS Gothic" w:eastAsia="MS Gothic" w:hAnsi="MS Gothic" w:hint="eastAsia"/>
-              <w:highlight w:val="lightGray"/>
             </w:rPr>
             <w:t>☐</w:t>
           </w:r>
@@ -2316,9 +2277,7 @@
       </w:pPr>
       <w:sdt>
         <w:sdtPr>
-          <w:rPr>
-            <w:highlight w:val="lightGray"/>
-          </w:rPr>
+          <w:rPr/>
           <w:id w:val="1082715932"/>
           <w14:checkbox>
             <w14:checked w14:val="0"/>
@@ -2332,7 +2291,6 @@
           <w:r>
             <w:rPr>
               <w:rFonts w:ascii="MS Gothic" w:eastAsia="MS Gothic" w:hAnsi="MS Gothic" w:hint="eastAsia"/>
-              <w:highlight w:val="lightGray"/>
             </w:rPr>
             <w:t>☐</w:t>
           </w:r>
@@ -2347,15 +2305,11 @@
       <w:pPr>
         <w:spacing w:after="0" w:line="265" w:lineRule="auto"/>
         <w:ind w:left="567"/>
-        <w:rPr>
-          <w:highlight w:val="lightGray"/>
-        </w:rPr>
+        <w:rPr/>
       </w:pPr>
       <w:sdt>
         <w:sdtPr>
-          <w:rPr>
-            <w:highlight w:val="lightGray"/>
-          </w:rPr>
+          <w:rPr/>
           <w:id w:val="-891963867"/>
           <w14:checkbox>
             <w14:checked w14:val="0"/>
@@ -2369,7 +2323,6 @@
           <w:r>
             <w:rPr>
               <w:rFonts w:ascii="MS Gothic" w:eastAsia="MS Gothic" w:hAnsi="MS Gothic" w:hint="eastAsia"/>
-              <w:highlight w:val="lightGray"/>
             </w:rPr>
             <w:t>☐</w:t>
           </w:r>
@@ -2387,9 +2340,7 @@
       </w:pPr>
       <w:sdt>
         <w:sdtPr>
-          <w:rPr>
-            <w:highlight w:val="lightGray"/>
-          </w:rPr>
+          <w:rPr/>
           <w:id w:val="852771072"/>
           <w14:checkbox>
             <w14:checked w14:val="0"/>
@@ -2403,7 +2354,6 @@
           <w:r>
             <w:rPr>
               <w:rFonts w:ascii="MS Gothic" w:eastAsia="MS Gothic" w:hAnsi="MS Gothic" w:hint="eastAsia"/>
-              <w:highlight w:val="lightGray"/>
             </w:rPr>
             <w:t>☐</w:t>
           </w:r>
@@ -4742,15 +4692,11 @@
             <w:pPr>
               <w:spacing w:after="0" w:line="259" w:lineRule="auto"/>
               <w:ind w:left="0" w:firstLine="0"/>
-              <w:rPr>
-                <w:highlight w:val="lightGray"/>
-              </w:rPr>
+              <w:rPr/>
             </w:pPr>
             <w:permStart w:id="335300879" w:edGrp="everyone"/>
             <w:r>
-              <w:rPr>
-                <w:highlight w:val="lightGray"/>
-              </w:rPr>
+              <w:rPr/>
               <w:t>{prenom_nom_signataire_bas}</w:t>
             </w:r>
             <w:permEnd w:id="335300879"/>
@@ -4762,9 +4708,7 @@
             </w:pPr>
             <w:permStart w:id="1121283164" w:edGrp="everyone"/>
             <w:r>
-              <w:rPr>
-                <w:highlight w:val="lightGray"/>
-              </w:rPr>
+              <w:rPr/>
               <w:t>{fonction_signataire_bas}</w:t>
             </w:r>
             <w:permEnd w:id="1121283164"/>
@@ -5725,7 +5669,6 @@
                 <w:rFonts w:ascii="Calibri" w:hAnsi="Calibri"/>
                 <w:sz w:val="20"/>
                 <w:szCs w:val="15"/>
-                <w:highlight w:val="lightGray"/>
               </w:rPr>
               <w:t>{nom_client}</w:t>
             </w:r>
@@ -5753,7 +5696,6 @@
                 <w:rFonts w:ascii="Calibri" w:hAnsi="Calibri"/>
                 <w:sz w:val="20"/>
                 <w:szCs w:val="15"/>
-                <w:highlight w:val="lightGray"/>
               </w:rPr>
               <w:t>{adresse_facturation}</w:t>
             </w:r>
@@ -5779,7 +5721,6 @@
                 <w:rFonts w:ascii="Calibri" w:hAnsi="Calibri"/>
                 <w:sz w:val="20"/>
                 <w:szCs w:val="15"/>
-                <w:highlight w:val="lightGray"/>
               </w:rPr>
               <w:t>{cp_ville_facturation}</w:t>
             </w:r>
@@ -5962,7 +5903,6 @@
                 <w:rFonts w:ascii="Calibri" w:hAnsi="Calibri"/>
                 <w:iCs/>
                 <w:sz w:val="28"/>
-                <w:highlight w:val="lightGray"/>
               </w:rPr>
               <w:t>_ _ _ _ _ _ _ _ _ _ _ _ _ _ _ _ _ _ _ _ _ _ _ _ _ _ _ _ _ _ _ _</w:t>
             </w:r>
@@ -6026,7 +5966,6 @@
                 <w:rFonts w:ascii="Calibri" w:hAnsi="Calibri"/>
                 <w:iCs/>
                 <w:sz w:val="28"/>
-                <w:highlight w:val="lightGray"/>
               </w:rPr>
               <w:t>_ _ _ _ _ _ _ _ _ _ _ _ _ _ _ _ _ _ _ _ _ _ _ _ _ _ _ _ _</w:t>
             </w:r>
@@ -6215,7 +6154,6 @@
                     <w:rPr>
                       <w:rFonts w:ascii="Calibri" w:hAnsi="Calibri"/>
                       <w:szCs w:val="28"/>
-                      <w:highlight w:val="lightGray"/>
                     </w:rPr>
                     <w:t>_ _ _ _ _ _ _</w:t>
                   </w:r>
@@ -6226,7 +6164,6 @@
                       <w:b/>
                       <w:bCs/>
                       <w:szCs w:val="28"/>
-                      <w:highlight w:val="lightGray"/>
                     </w:rPr>
                     <w:t xml:space="preserve"> </w:t>
                   </w:r>
@@ -6262,7 +6199,6 @@
                     <w:rPr>
                       <w:rFonts w:ascii="Calibri" w:hAnsi="Calibri"/>
                       <w:szCs w:val="28"/>
-                      <w:highlight w:val="lightGray"/>
                     </w:rPr>
                     <w:t>_ _ _ _ _ _ _ _</w:t>
                   </w:r>
@@ -6273,7 +6209,6 @@
                       <w:b/>
                       <w:bCs/>
                       <w:szCs w:val="28"/>
-                      <w:highlight w:val="lightGray"/>
                     </w:rPr>
                     <w:t xml:space="preserve"> </w:t>
                   </w:r>
@@ -6399,7 +6334,6 @@
         <w:rPr>
           <w:sz w:val="24"/>
           <w:szCs w:val="24"/>
-          <w:highlight w:val="lightGray"/>
         </w:rPr>
         <w:t>Merci de joindre</w:t>
       </w:r>
@@ -6408,7 +6342,6 @@
           <w:b/>
           <w:sz w:val="24"/>
           <w:szCs w:val="24"/>
-          <w:highlight w:val="lightGray"/>
           <w:u w:val="single"/>
         </w:rPr>
         <w:t xml:space="preserve"> un RIB</w:t>

</xml_diff>

<commit_message>
Templates: suppression des lignes vides apres les boucles de sites
Co-Authored-By: Claude Sonnet 4.6 <noreply@anthropic.com>
</commit_message>
<xml_diff>
--- a/public/templates/template_C2.docx
+++ b/public/templates/template_C2.docx
@@ -3431,854 +3431,6 @@
               </w:rPr>
               <w:t>{puiss_hce}{/sites}</w:t>
             </w:r>
-          </w:p>
-        </w:tc>
-      </w:tr>
-      <w:tr>
-        <w:tc>
-          <w:tcPr>
-            <w:tcW w:w="486" w:type="pct"/>
-          </w:tcPr>
-          <w:p>
-            <w:pPr>
-              <w:ind w:left="0" w:firstLine="0"/>
-              <w:jc w:val="center"/>
-              <w:rPr>
-                <w:sz w:val="16"/>
-                <w:szCs w:val="16"/>
-              </w:rPr>
-            </w:pPr>
-          </w:p>
-        </w:tc>
-        <w:tc>
-          <w:tcPr>
-            <w:tcW w:w="475" w:type="pct"/>
-          </w:tcPr>
-          <w:p>
-            <w:pPr>
-              <w:ind w:left="0" w:firstLine="0"/>
-              <w:jc w:val="center"/>
-              <w:rPr>
-                <w:sz w:val="16"/>
-                <w:szCs w:val="16"/>
-              </w:rPr>
-            </w:pPr>
-          </w:p>
-        </w:tc>
-        <w:tc>
-          <w:tcPr>
-            <w:tcW w:w="228" w:type="pct"/>
-          </w:tcPr>
-          <w:p>
-            <w:pPr>
-              <w:ind w:left="0" w:firstLine="0"/>
-              <w:jc w:val="center"/>
-              <w:rPr>
-                <w:sz w:val="16"/>
-                <w:szCs w:val="16"/>
-              </w:rPr>
-            </w:pPr>
-          </w:p>
-        </w:tc>
-        <w:tc>
-          <w:tcPr>
-            <w:tcW w:w="778" w:type="pct"/>
-          </w:tcPr>
-          <w:p>
-            <w:pPr>
-              <w:ind w:left="0" w:firstLine="0"/>
-              <w:jc w:val="center"/>
-              <w:rPr>
-                <w:sz w:val="16"/>
-                <w:szCs w:val="16"/>
-              </w:rPr>
-            </w:pPr>
-          </w:p>
-        </w:tc>
-        <w:tc>
-          <w:tcPr>
-            <w:tcW w:w="295" w:type="pct"/>
-          </w:tcPr>
-          <w:p>
-            <w:pPr>
-              <w:ind w:left="0" w:firstLine="0"/>
-              <w:jc w:val="center"/>
-              <w:rPr>
-                <w:sz w:val="16"/>
-                <w:szCs w:val="16"/>
-              </w:rPr>
-            </w:pPr>
-          </w:p>
-        </w:tc>
-        <w:tc>
-          <w:tcPr>
-            <w:tcW w:w="317" w:type="pct"/>
-          </w:tcPr>
-          <w:p>
-            <w:pPr>
-              <w:ind w:left="0" w:firstLine="0"/>
-              <w:jc w:val="center"/>
-              <w:rPr>
-                <w:sz w:val="16"/>
-                <w:szCs w:val="16"/>
-              </w:rPr>
-            </w:pPr>
-          </w:p>
-        </w:tc>
-        <w:tc>
-          <w:tcPr>
-            <w:tcW w:w="213" w:type="pct"/>
-          </w:tcPr>
-          <w:p>
-            <w:pPr>
-              <w:ind w:left="0" w:firstLine="0"/>
-              <w:jc w:val="center"/>
-              <w:rPr>
-                <w:sz w:val="16"/>
-                <w:szCs w:val="16"/>
-              </w:rPr>
-            </w:pPr>
-          </w:p>
-        </w:tc>
-        <w:tc>
-          <w:tcPr>
-            <w:tcW w:w="459" w:type="pct"/>
-          </w:tcPr>
-          <w:p>
-            <w:pPr>
-              <w:ind w:left="0" w:firstLine="0"/>
-              <w:jc w:val="center"/>
-              <w:rPr>
-                <w:sz w:val="16"/>
-                <w:szCs w:val="16"/>
-              </w:rPr>
-            </w:pPr>
-          </w:p>
-        </w:tc>
-        <w:tc>
-          <w:tcPr>
-            <w:tcW w:w="384" w:type="pct"/>
-          </w:tcPr>
-          <w:p>
-            <w:pPr>
-              <w:ind w:left="0" w:firstLine="0"/>
-              <w:jc w:val="center"/>
-              <w:rPr>
-                <w:sz w:val="16"/>
-                <w:szCs w:val="16"/>
-              </w:rPr>
-            </w:pPr>
-          </w:p>
-        </w:tc>
-        <w:tc>
-          <w:tcPr>
-            <w:tcW w:w="324" w:type="pct"/>
-          </w:tcPr>
-          <w:p>
-            <w:pPr>
-              <w:ind w:left="0" w:firstLine="0"/>
-              <w:jc w:val="center"/>
-              <w:rPr>
-                <w:sz w:val="16"/>
-                <w:szCs w:val="16"/>
-              </w:rPr>
-            </w:pPr>
-          </w:p>
-        </w:tc>
-        <w:tc>
-          <w:tcPr>
-            <w:tcW w:w="260" w:type="pct"/>
-          </w:tcPr>
-          <w:p>
-            <w:pPr>
-              <w:ind w:left="0" w:firstLine="0"/>
-              <w:jc w:val="center"/>
-              <w:rPr>
-                <w:sz w:val="16"/>
-                <w:szCs w:val="16"/>
-              </w:rPr>
-            </w:pPr>
-          </w:p>
-        </w:tc>
-        <w:tc>
-          <w:tcPr>
-            <w:tcW w:w="260" w:type="pct"/>
-          </w:tcPr>
-          <w:p>
-            <w:pPr>
-              <w:ind w:left="0" w:firstLine="0"/>
-              <w:jc w:val="center"/>
-              <w:rPr>
-                <w:sz w:val="16"/>
-                <w:szCs w:val="16"/>
-              </w:rPr>
-            </w:pPr>
-          </w:p>
-        </w:tc>
-        <w:tc>
-          <w:tcPr>
-            <w:tcW w:w="260" w:type="pct"/>
-          </w:tcPr>
-          <w:p>
-            <w:pPr>
-              <w:ind w:left="0" w:firstLine="0"/>
-              <w:jc w:val="center"/>
-              <w:rPr>
-                <w:sz w:val="16"/>
-                <w:szCs w:val="16"/>
-              </w:rPr>
-            </w:pPr>
-          </w:p>
-        </w:tc>
-        <w:tc>
-          <w:tcPr>
-            <w:tcW w:w="258" w:type="pct"/>
-          </w:tcPr>
-          <w:p>
-            <w:pPr>
-              <w:ind w:left="0" w:firstLine="0"/>
-              <w:jc w:val="center"/>
-              <w:rPr>
-                <w:sz w:val="16"/>
-                <w:szCs w:val="16"/>
-              </w:rPr>
-            </w:pPr>
-          </w:p>
-        </w:tc>
-      </w:tr>
-      <w:tr>
-        <w:tc>
-          <w:tcPr>
-            <w:tcW w:w="486" w:type="pct"/>
-          </w:tcPr>
-          <w:p>
-            <w:pPr>
-              <w:ind w:left="0" w:firstLine="0"/>
-              <w:jc w:val="center"/>
-              <w:rPr>
-                <w:sz w:val="16"/>
-                <w:szCs w:val="16"/>
-              </w:rPr>
-            </w:pPr>
-          </w:p>
-        </w:tc>
-        <w:tc>
-          <w:tcPr>
-            <w:tcW w:w="475" w:type="pct"/>
-          </w:tcPr>
-          <w:p>
-            <w:pPr>
-              <w:ind w:left="0" w:firstLine="0"/>
-              <w:jc w:val="center"/>
-              <w:rPr>
-                <w:sz w:val="16"/>
-                <w:szCs w:val="16"/>
-              </w:rPr>
-            </w:pPr>
-          </w:p>
-        </w:tc>
-        <w:tc>
-          <w:tcPr>
-            <w:tcW w:w="228" w:type="pct"/>
-          </w:tcPr>
-          <w:p>
-            <w:pPr>
-              <w:ind w:left="0" w:firstLine="0"/>
-              <w:jc w:val="center"/>
-              <w:rPr>
-                <w:sz w:val="16"/>
-                <w:szCs w:val="16"/>
-              </w:rPr>
-            </w:pPr>
-          </w:p>
-        </w:tc>
-        <w:tc>
-          <w:tcPr>
-            <w:tcW w:w="778" w:type="pct"/>
-          </w:tcPr>
-          <w:p>
-            <w:pPr>
-              <w:ind w:left="0" w:firstLine="0"/>
-              <w:jc w:val="center"/>
-              <w:rPr>
-                <w:sz w:val="16"/>
-                <w:szCs w:val="16"/>
-              </w:rPr>
-            </w:pPr>
-          </w:p>
-        </w:tc>
-        <w:tc>
-          <w:tcPr>
-            <w:tcW w:w="295" w:type="pct"/>
-          </w:tcPr>
-          <w:p>
-            <w:pPr>
-              <w:ind w:left="0" w:firstLine="0"/>
-              <w:jc w:val="center"/>
-              <w:rPr>
-                <w:sz w:val="16"/>
-                <w:szCs w:val="16"/>
-              </w:rPr>
-            </w:pPr>
-          </w:p>
-        </w:tc>
-        <w:tc>
-          <w:tcPr>
-            <w:tcW w:w="317" w:type="pct"/>
-          </w:tcPr>
-          <w:p>
-            <w:pPr>
-              <w:ind w:left="0" w:firstLine="0"/>
-              <w:jc w:val="center"/>
-              <w:rPr>
-                <w:sz w:val="16"/>
-                <w:szCs w:val="16"/>
-              </w:rPr>
-            </w:pPr>
-          </w:p>
-        </w:tc>
-        <w:tc>
-          <w:tcPr>
-            <w:tcW w:w="213" w:type="pct"/>
-          </w:tcPr>
-          <w:p>
-            <w:pPr>
-              <w:ind w:left="0" w:firstLine="0"/>
-              <w:jc w:val="center"/>
-              <w:rPr>
-                <w:sz w:val="16"/>
-                <w:szCs w:val="16"/>
-              </w:rPr>
-            </w:pPr>
-          </w:p>
-        </w:tc>
-        <w:tc>
-          <w:tcPr>
-            <w:tcW w:w="459" w:type="pct"/>
-          </w:tcPr>
-          <w:p>
-            <w:pPr>
-              <w:ind w:left="0" w:firstLine="0"/>
-              <w:jc w:val="center"/>
-              <w:rPr>
-                <w:sz w:val="16"/>
-                <w:szCs w:val="16"/>
-              </w:rPr>
-            </w:pPr>
-          </w:p>
-        </w:tc>
-        <w:tc>
-          <w:tcPr>
-            <w:tcW w:w="384" w:type="pct"/>
-          </w:tcPr>
-          <w:p>
-            <w:pPr>
-              <w:ind w:left="0" w:firstLine="0"/>
-              <w:jc w:val="center"/>
-              <w:rPr>
-                <w:sz w:val="16"/>
-                <w:szCs w:val="16"/>
-              </w:rPr>
-            </w:pPr>
-          </w:p>
-        </w:tc>
-        <w:tc>
-          <w:tcPr>
-            <w:tcW w:w="324" w:type="pct"/>
-          </w:tcPr>
-          <w:p>
-            <w:pPr>
-              <w:ind w:left="0" w:firstLine="0"/>
-              <w:jc w:val="center"/>
-              <w:rPr>
-                <w:sz w:val="16"/>
-                <w:szCs w:val="16"/>
-              </w:rPr>
-            </w:pPr>
-          </w:p>
-        </w:tc>
-        <w:tc>
-          <w:tcPr>
-            <w:tcW w:w="260" w:type="pct"/>
-          </w:tcPr>
-          <w:p>
-            <w:pPr>
-              <w:ind w:left="0" w:firstLine="0"/>
-              <w:jc w:val="center"/>
-              <w:rPr>
-                <w:sz w:val="16"/>
-                <w:szCs w:val="16"/>
-              </w:rPr>
-            </w:pPr>
-          </w:p>
-        </w:tc>
-        <w:tc>
-          <w:tcPr>
-            <w:tcW w:w="260" w:type="pct"/>
-          </w:tcPr>
-          <w:p>
-            <w:pPr>
-              <w:ind w:left="0" w:firstLine="0"/>
-              <w:jc w:val="center"/>
-              <w:rPr>
-                <w:sz w:val="16"/>
-                <w:szCs w:val="16"/>
-              </w:rPr>
-            </w:pPr>
-          </w:p>
-        </w:tc>
-        <w:tc>
-          <w:tcPr>
-            <w:tcW w:w="260" w:type="pct"/>
-          </w:tcPr>
-          <w:p>
-            <w:pPr>
-              <w:ind w:left="0" w:firstLine="0"/>
-              <w:jc w:val="center"/>
-              <w:rPr>
-                <w:sz w:val="16"/>
-                <w:szCs w:val="16"/>
-              </w:rPr>
-            </w:pPr>
-          </w:p>
-        </w:tc>
-        <w:tc>
-          <w:tcPr>
-            <w:tcW w:w="258" w:type="pct"/>
-          </w:tcPr>
-          <w:p>
-            <w:pPr>
-              <w:ind w:left="0" w:firstLine="0"/>
-              <w:jc w:val="center"/>
-              <w:rPr>
-                <w:sz w:val="16"/>
-                <w:szCs w:val="16"/>
-              </w:rPr>
-            </w:pPr>
-          </w:p>
-        </w:tc>
-      </w:tr>
-      <w:tr>
-        <w:tc>
-          <w:tcPr>
-            <w:tcW w:w="486" w:type="pct"/>
-          </w:tcPr>
-          <w:p>
-            <w:pPr>
-              <w:ind w:left="0" w:firstLine="0"/>
-              <w:jc w:val="center"/>
-              <w:rPr>
-                <w:sz w:val="16"/>
-                <w:szCs w:val="16"/>
-              </w:rPr>
-            </w:pPr>
-          </w:p>
-        </w:tc>
-        <w:tc>
-          <w:tcPr>
-            <w:tcW w:w="475" w:type="pct"/>
-          </w:tcPr>
-          <w:p>
-            <w:pPr>
-              <w:ind w:left="0" w:firstLine="0"/>
-              <w:jc w:val="center"/>
-              <w:rPr>
-                <w:sz w:val="16"/>
-                <w:szCs w:val="16"/>
-              </w:rPr>
-            </w:pPr>
-          </w:p>
-        </w:tc>
-        <w:tc>
-          <w:tcPr>
-            <w:tcW w:w="228" w:type="pct"/>
-          </w:tcPr>
-          <w:p>
-            <w:pPr>
-              <w:ind w:left="0" w:firstLine="0"/>
-              <w:jc w:val="center"/>
-              <w:rPr>
-                <w:sz w:val="16"/>
-                <w:szCs w:val="16"/>
-              </w:rPr>
-            </w:pPr>
-          </w:p>
-        </w:tc>
-        <w:tc>
-          <w:tcPr>
-            <w:tcW w:w="778" w:type="pct"/>
-          </w:tcPr>
-          <w:p>
-            <w:pPr>
-              <w:ind w:left="0" w:firstLine="0"/>
-              <w:jc w:val="center"/>
-              <w:rPr>
-                <w:sz w:val="16"/>
-                <w:szCs w:val="16"/>
-              </w:rPr>
-            </w:pPr>
-          </w:p>
-        </w:tc>
-        <w:tc>
-          <w:tcPr>
-            <w:tcW w:w="295" w:type="pct"/>
-          </w:tcPr>
-          <w:p>
-            <w:pPr>
-              <w:ind w:left="0" w:firstLine="0"/>
-              <w:jc w:val="center"/>
-              <w:rPr>
-                <w:sz w:val="16"/>
-                <w:szCs w:val="16"/>
-              </w:rPr>
-            </w:pPr>
-          </w:p>
-        </w:tc>
-        <w:tc>
-          <w:tcPr>
-            <w:tcW w:w="317" w:type="pct"/>
-          </w:tcPr>
-          <w:p>
-            <w:pPr>
-              <w:ind w:left="0" w:firstLine="0"/>
-              <w:jc w:val="center"/>
-              <w:rPr>
-                <w:sz w:val="16"/>
-                <w:szCs w:val="16"/>
-              </w:rPr>
-            </w:pPr>
-          </w:p>
-        </w:tc>
-        <w:tc>
-          <w:tcPr>
-            <w:tcW w:w="213" w:type="pct"/>
-          </w:tcPr>
-          <w:p>
-            <w:pPr>
-              <w:ind w:left="0" w:firstLine="0"/>
-              <w:jc w:val="center"/>
-              <w:rPr>
-                <w:sz w:val="16"/>
-                <w:szCs w:val="16"/>
-              </w:rPr>
-            </w:pPr>
-          </w:p>
-        </w:tc>
-        <w:tc>
-          <w:tcPr>
-            <w:tcW w:w="459" w:type="pct"/>
-          </w:tcPr>
-          <w:p>
-            <w:pPr>
-              <w:ind w:left="0" w:firstLine="0"/>
-              <w:jc w:val="center"/>
-              <w:rPr>
-                <w:sz w:val="16"/>
-                <w:szCs w:val="16"/>
-              </w:rPr>
-            </w:pPr>
-          </w:p>
-        </w:tc>
-        <w:tc>
-          <w:tcPr>
-            <w:tcW w:w="384" w:type="pct"/>
-          </w:tcPr>
-          <w:p>
-            <w:pPr>
-              <w:ind w:left="0" w:firstLine="0"/>
-              <w:jc w:val="center"/>
-              <w:rPr>
-                <w:sz w:val="16"/>
-                <w:szCs w:val="16"/>
-              </w:rPr>
-            </w:pPr>
-          </w:p>
-        </w:tc>
-        <w:tc>
-          <w:tcPr>
-            <w:tcW w:w="324" w:type="pct"/>
-          </w:tcPr>
-          <w:p>
-            <w:pPr>
-              <w:ind w:left="0" w:firstLine="0"/>
-              <w:jc w:val="center"/>
-              <w:rPr>
-                <w:sz w:val="16"/>
-                <w:szCs w:val="16"/>
-              </w:rPr>
-            </w:pPr>
-          </w:p>
-        </w:tc>
-        <w:tc>
-          <w:tcPr>
-            <w:tcW w:w="260" w:type="pct"/>
-          </w:tcPr>
-          <w:p>
-            <w:pPr>
-              <w:ind w:left="0" w:firstLine="0"/>
-              <w:jc w:val="center"/>
-              <w:rPr>
-                <w:sz w:val="16"/>
-                <w:szCs w:val="16"/>
-              </w:rPr>
-            </w:pPr>
-          </w:p>
-        </w:tc>
-        <w:tc>
-          <w:tcPr>
-            <w:tcW w:w="260" w:type="pct"/>
-          </w:tcPr>
-          <w:p>
-            <w:pPr>
-              <w:ind w:left="0" w:firstLine="0"/>
-              <w:jc w:val="center"/>
-              <w:rPr>
-                <w:sz w:val="16"/>
-                <w:szCs w:val="16"/>
-              </w:rPr>
-            </w:pPr>
-          </w:p>
-        </w:tc>
-        <w:tc>
-          <w:tcPr>
-            <w:tcW w:w="260" w:type="pct"/>
-          </w:tcPr>
-          <w:p>
-            <w:pPr>
-              <w:ind w:left="0" w:firstLine="0"/>
-              <w:jc w:val="center"/>
-              <w:rPr>
-                <w:sz w:val="16"/>
-                <w:szCs w:val="16"/>
-              </w:rPr>
-            </w:pPr>
-          </w:p>
-        </w:tc>
-        <w:tc>
-          <w:tcPr>
-            <w:tcW w:w="258" w:type="pct"/>
-          </w:tcPr>
-          <w:p>
-            <w:pPr>
-              <w:ind w:left="0" w:firstLine="0"/>
-              <w:jc w:val="center"/>
-              <w:rPr>
-                <w:sz w:val="16"/>
-                <w:szCs w:val="16"/>
-              </w:rPr>
-            </w:pPr>
-          </w:p>
-        </w:tc>
-      </w:tr>
-      <w:tr>
-        <w:tc>
-          <w:tcPr>
-            <w:tcW w:w="486" w:type="pct"/>
-          </w:tcPr>
-          <w:p>
-            <w:pPr>
-              <w:ind w:left="0" w:firstLine="0"/>
-              <w:jc w:val="center"/>
-              <w:rPr>
-                <w:sz w:val="16"/>
-                <w:szCs w:val="16"/>
-              </w:rPr>
-            </w:pPr>
-          </w:p>
-        </w:tc>
-        <w:tc>
-          <w:tcPr>
-            <w:tcW w:w="475" w:type="pct"/>
-          </w:tcPr>
-          <w:p>
-            <w:pPr>
-              <w:ind w:left="0" w:firstLine="0"/>
-              <w:jc w:val="center"/>
-              <w:rPr>
-                <w:sz w:val="16"/>
-                <w:szCs w:val="16"/>
-              </w:rPr>
-            </w:pPr>
-          </w:p>
-        </w:tc>
-        <w:tc>
-          <w:tcPr>
-            <w:tcW w:w="228" w:type="pct"/>
-          </w:tcPr>
-          <w:p>
-            <w:pPr>
-              <w:ind w:left="0" w:firstLine="0"/>
-              <w:jc w:val="center"/>
-              <w:rPr>
-                <w:sz w:val="16"/>
-                <w:szCs w:val="16"/>
-              </w:rPr>
-            </w:pPr>
-          </w:p>
-        </w:tc>
-        <w:tc>
-          <w:tcPr>
-            <w:tcW w:w="778" w:type="pct"/>
-          </w:tcPr>
-          <w:p>
-            <w:pPr>
-              <w:ind w:left="0" w:firstLine="0"/>
-              <w:jc w:val="center"/>
-              <w:rPr>
-                <w:sz w:val="16"/>
-                <w:szCs w:val="16"/>
-              </w:rPr>
-            </w:pPr>
-          </w:p>
-        </w:tc>
-        <w:tc>
-          <w:tcPr>
-            <w:tcW w:w="295" w:type="pct"/>
-          </w:tcPr>
-          <w:p>
-            <w:pPr>
-              <w:ind w:left="0" w:firstLine="0"/>
-              <w:jc w:val="center"/>
-              <w:rPr>
-                <w:sz w:val="16"/>
-                <w:szCs w:val="16"/>
-              </w:rPr>
-            </w:pPr>
-          </w:p>
-        </w:tc>
-        <w:tc>
-          <w:tcPr>
-            <w:tcW w:w="317" w:type="pct"/>
-          </w:tcPr>
-          <w:p>
-            <w:pPr>
-              <w:ind w:left="0" w:firstLine="0"/>
-              <w:jc w:val="center"/>
-              <w:rPr>
-                <w:sz w:val="16"/>
-                <w:szCs w:val="16"/>
-              </w:rPr>
-            </w:pPr>
-          </w:p>
-        </w:tc>
-        <w:tc>
-          <w:tcPr>
-            <w:tcW w:w="213" w:type="pct"/>
-          </w:tcPr>
-          <w:p>
-            <w:pPr>
-              <w:ind w:left="0" w:firstLine="0"/>
-              <w:jc w:val="center"/>
-              <w:rPr>
-                <w:sz w:val="16"/>
-                <w:szCs w:val="16"/>
-              </w:rPr>
-            </w:pPr>
-          </w:p>
-        </w:tc>
-        <w:tc>
-          <w:tcPr>
-            <w:tcW w:w="459" w:type="pct"/>
-          </w:tcPr>
-          <w:p>
-            <w:pPr>
-              <w:ind w:left="0" w:firstLine="0"/>
-              <w:jc w:val="center"/>
-              <w:rPr>
-                <w:sz w:val="16"/>
-                <w:szCs w:val="16"/>
-              </w:rPr>
-            </w:pPr>
-          </w:p>
-        </w:tc>
-        <w:tc>
-          <w:tcPr>
-            <w:tcW w:w="384" w:type="pct"/>
-          </w:tcPr>
-          <w:p>
-            <w:pPr>
-              <w:ind w:left="0" w:firstLine="0"/>
-              <w:jc w:val="center"/>
-              <w:rPr>
-                <w:sz w:val="16"/>
-                <w:szCs w:val="16"/>
-              </w:rPr>
-            </w:pPr>
-          </w:p>
-        </w:tc>
-        <w:tc>
-          <w:tcPr>
-            <w:tcW w:w="324" w:type="pct"/>
-          </w:tcPr>
-          <w:p>
-            <w:pPr>
-              <w:ind w:left="0" w:firstLine="0"/>
-              <w:jc w:val="center"/>
-              <w:rPr>
-                <w:sz w:val="16"/>
-                <w:szCs w:val="16"/>
-              </w:rPr>
-            </w:pPr>
-          </w:p>
-        </w:tc>
-        <w:tc>
-          <w:tcPr>
-            <w:tcW w:w="260" w:type="pct"/>
-          </w:tcPr>
-          <w:p>
-            <w:pPr>
-              <w:ind w:left="0" w:firstLine="0"/>
-              <w:jc w:val="center"/>
-              <w:rPr>
-                <w:sz w:val="16"/>
-                <w:szCs w:val="16"/>
-              </w:rPr>
-            </w:pPr>
-          </w:p>
-        </w:tc>
-        <w:tc>
-          <w:tcPr>
-            <w:tcW w:w="260" w:type="pct"/>
-          </w:tcPr>
-          <w:p>
-            <w:pPr>
-              <w:ind w:left="0" w:firstLine="0"/>
-              <w:jc w:val="center"/>
-              <w:rPr>
-                <w:sz w:val="16"/>
-                <w:szCs w:val="16"/>
-              </w:rPr>
-            </w:pPr>
-          </w:p>
-        </w:tc>
-        <w:tc>
-          <w:tcPr>
-            <w:tcW w:w="260" w:type="pct"/>
-          </w:tcPr>
-          <w:p>
-            <w:pPr>
-              <w:ind w:left="0" w:firstLine="0"/>
-              <w:jc w:val="center"/>
-              <w:rPr>
-                <w:sz w:val="16"/>
-                <w:szCs w:val="16"/>
-              </w:rPr>
-            </w:pPr>
-          </w:p>
-        </w:tc>
-        <w:tc>
-          <w:tcPr>
-            <w:tcW w:w="258" w:type="pct"/>
-          </w:tcPr>
-          <w:p>
-            <w:pPr>
-              <w:ind w:left="0" w:firstLine="0"/>
-              <w:jc w:val="center"/>
-              <w:rPr>
-                <w:sz w:val="16"/>
-                <w:szCs w:val="16"/>
-              </w:rPr>
-            </w:pPr>
           </w:p>
         </w:tc>
       </w:tr>

</xml_diff>